<commit_message>
with latest assighnments prints
</commit_message>
<xml_diff>
--- a/Ediable Plants.docx
+++ b/Ediable Plants.docx
@@ -23,8 +23,6 @@
         </w:rPr>
         <w:t>Ediable Plants</w:t>
       </w:r>
-      <w:bookmarkStart w:id="0" w:name="_GoBack"/>
-      <w:bookmarkEnd w:id="0"/>
     </w:p>
     <w:p>
       <w:pPr>
@@ -46,9 +44,80 @@
           <w:noProof/>
         </w:rPr>
         <w:drawing>
-          <wp:inline distT="0" distB="0" distL="0" distR="0" wp14:anchorId="75FAA9E3" wp14:editId="7D88F7D3">
-            <wp:extent cx="5731510" cy="6178851"/>
-            <wp:effectExtent l="0" t="0" r="2540" b="0"/>
+          <wp:anchor distT="0" distB="0" distL="114300" distR="114300" simplePos="0" relativeHeight="251658240" behindDoc="1" locked="0" layoutInCell="1" allowOverlap="1" wp14:anchorId="42AAF104" wp14:editId="36FC36E0">
+            <wp:simplePos x="0" y="0"/>
+            <wp:positionH relativeFrom="margin">
+              <wp:align>center</wp:align>
+            </wp:positionH>
+            <wp:positionV relativeFrom="paragraph">
+              <wp:posOffset>4083950</wp:posOffset>
+            </wp:positionV>
+            <wp:extent cx="5472430" cy="2497231"/>
+            <wp:effectExtent l="0" t="0" r="0" b="0"/>
+            <wp:wrapNone/>
+            <wp:docPr id="2" name="Picture 2" descr="Edible v. Non-Edible Plant - Plant Classification Sort by Teach Fun in First"/>
+            <wp:cNvGraphicFramePr>
+              <a:graphicFrameLocks xmlns:a="http://schemas.openxmlformats.org/drawingml/2006/main" noChangeAspect="1"/>
+            </wp:cNvGraphicFramePr>
+            <a:graphic xmlns:a="http://schemas.openxmlformats.org/drawingml/2006/main">
+              <a:graphicData uri="http://schemas.openxmlformats.org/drawingml/2006/picture">
+                <pic:pic xmlns:pic="http://schemas.openxmlformats.org/drawingml/2006/picture">
+                  <pic:nvPicPr>
+                    <pic:cNvPr id="0" name="Picture 1" descr="Edible v. Non-Edible Plant - Plant Classification Sort by Teach Fun in First"/>
+                    <pic:cNvPicPr>
+                      <a:picLocks noChangeAspect="1" noChangeArrowheads="1"/>
+                    </pic:cNvPicPr>
+                  </pic:nvPicPr>
+                  <pic:blipFill rotWithShape="1">
+                    <a:blip r:embed="rId4">
+                      <a:extLst>
+                        <a:ext uri="{28A0092B-C50C-407E-A947-70E740481C1C}">
+                          <a14:useLocalDpi xmlns:a14="http://schemas.microsoft.com/office/drawing/2010/main" val="0"/>
+                        </a:ext>
+                      </a:extLst>
+                    </a:blip>
+                    <a:srcRect t="25002"/>
+                    <a:stretch/>
+                  </pic:blipFill>
+                  <pic:spPr bwMode="auto">
+                    <a:xfrm>
+                      <a:off x="0" y="0"/>
+                      <a:ext cx="5472430" cy="2497231"/>
+                    </a:xfrm>
+                    <a:prstGeom prst="rect">
+                      <a:avLst/>
+                    </a:prstGeom>
+                    <a:noFill/>
+                    <a:ln>
+                      <a:noFill/>
+                    </a:ln>
+                    <a:extLst>
+                      <a:ext uri="{53640926-AAD7-44D8-BBD7-CCE9431645EC}">
+                        <a14:shadowObscured xmlns:a14="http://schemas.microsoft.com/office/drawing/2010/main"/>
+                      </a:ext>
+                    </a:extLst>
+                  </pic:spPr>
+                </pic:pic>
+              </a:graphicData>
+            </a:graphic>
+            <wp14:sizeRelH relativeFrom="page">
+              <wp14:pctWidth>0</wp14:pctWidth>
+            </wp14:sizeRelH>
+            <wp14:sizeRelV relativeFrom="page">
+              <wp14:pctHeight>0</wp14:pctHeight>
+            </wp14:sizeRelV>
+          </wp:anchor>
+        </w:drawing>
+      </w:r>
+      <w:bookmarkStart w:id="0" w:name="_GoBack"/>
+      <w:r>
+        <w:rPr>
+          <w:noProof/>
+        </w:rPr>
+        <w:drawing>
+          <wp:inline distT="0" distB="0" distL="0" distR="0" wp14:anchorId="75FAA9E3" wp14:editId="47E0066A">
+            <wp:extent cx="5731231" cy="3794078"/>
+            <wp:effectExtent l="0" t="0" r="3175" b="0"/>
             <wp:docPr id="1" name="Picture 1" descr="This may contain: an image of different types of wheat"/>
             <wp:cNvGraphicFramePr>
               <a:graphicFrameLocks xmlns:a="http://schemas.openxmlformats.org/drawingml/2006/main" noChangeAspect="1"/>
@@ -62,23 +131,21 @@
                       <a:picLocks noChangeAspect="1" noChangeArrowheads="1"/>
                     </pic:cNvPicPr>
                   </pic:nvPicPr>
-                  <pic:blipFill>
-                    <a:blip r:embed="rId4">
+                  <pic:blipFill rotWithShape="1">
+                    <a:blip r:embed="rId5">
                       <a:extLst>
                         <a:ext uri="{28A0092B-C50C-407E-A947-70E740481C1C}">
                           <a14:useLocalDpi xmlns:a14="http://schemas.microsoft.com/office/drawing/2010/main" val="0"/>
                         </a:ext>
                       </a:extLst>
                     </a:blip>
-                    <a:srcRect/>
-                    <a:stretch>
-                      <a:fillRect/>
-                    </a:stretch>
+                    <a:srcRect b="38593"/>
+                    <a:stretch/>
                   </pic:blipFill>
                   <pic:spPr bwMode="auto">
                     <a:xfrm>
                       <a:off x="0" y="0"/>
-                      <a:ext cx="5737914" cy="6185755"/>
+                      <a:ext cx="5737914" cy="3798502"/>
                     </a:xfrm>
                     <a:prstGeom prst="rect">
                       <a:avLst/>
@@ -87,6 +154,11 @@
                     <a:ln>
                       <a:noFill/>
                     </a:ln>
+                    <a:extLst>
+                      <a:ext uri="{53640926-AAD7-44D8-BBD7-CCE9431645EC}">
+                        <a14:shadowObscured xmlns:a14="http://schemas.microsoft.com/office/drawing/2010/main"/>
+                      </a:ext>
+                    </a:extLst>
                   </pic:spPr>
                 </pic:pic>
               </a:graphicData>
@@ -94,6 +166,7 @@
           </wp:inline>
         </w:drawing>
       </w:r>
+      <w:bookmarkEnd w:id="0"/>
     </w:p>
     <w:sectPr>
       <w:pgSz w:w="11906" w:h="16838"/>

</xml_diff>